<commit_message>
Pedoman diperinci per bab; proposal jadi BAB I; gambar/tabel per bab; abstrak, sitasi, margin
- Pedoman: bagian awal/isi/akhir, format penulisan, tata cara ujian, lampiran APA dan daftar periksa
- Proposal memakai gaya BAB I, tiap bab halaman baru
- Penomoran Gambar/Tabel per bab (1.1), tabel kotak penuh, abstrak maks. 300 kata
- Perbaikan margin PDF/Word, hapus sumber Python dan YouTube

Co-Authored-By: Claude Sonnet 5.5 <noreply@anthropic.com>
</commit_message>
<xml_diff>
--- a/hasil/formulir.docx
+++ b/hasil/formulir.docx
@@ -3045,7 +3045,7 @@
     <w:uiPriority w:val="59"/>
     <w:qFormat/>
     <w:tblPr>
-      <w:tblInd w:w="0" w:type="dxa"/>
+      <w:tblInd w:w="85" w:type="dxa"/>
       <w:tblBorders>
         <w:top w:val="single" w:sz="4" w:space="0" w:color="000000"/>
         <w:left w:val="single" w:sz="4" w:space="0" w:color="000000"/>
@@ -3068,7 +3068,7 @@
     <w:uiPriority w:val="59"/>
     <w:qFormat/>
     <w:tblPr>
-      <w:tblInd w:w="0" w:type="dxa"/>
+      <w:tblInd w:w="85" w:type="dxa"/>
       <w:tblBorders>
         <w:top w:val="nil"/>
         <w:left w:val="nil"/>

</xml_diff>